<commit_message>
implement similarity search and POST /api/v1/query endpoint
</commit_message>
<xml_diff>
--- a/tests/fixtures/sample.docx
+++ b/tests/fixtures/sample.docx
@@ -11,122 +11,99 @@
         <w:rPr>
           <w:rtl w:val="0"/>
         </w:rPr>
-        <w:t xml:space="preserve">Dave watched as the forest burned up on the hill, only a few miles from her house. The car had been hastily packed and Marta was inside trying to round up the last of the pets. Dave went through his mental list of the most important papers and documents that they couldn't leave behind. He scolded himself for not having prepared these better in advance and hoped that he had remembered everything that was needed. He continued to wait for Marta to appear with the pets, but she still was nowhere to be seen.</w:t>
-      </w:r>
-    </w:p>
-    <w:p>
-      <w:pPr>
-        <w:jc w:val="both"/>
-        <w:rPr/>
-      </w:pPr>
-      <w:r>
-        <w:rPr>
-          <w:rtl w:val="0"/>
-        </w:rPr>
-      </w:r>
-    </w:p>
-    <w:p>
-      <w:pPr>
-        <w:jc w:val="both"/>
-        <w:rPr/>
-      </w:pPr>
-      <w:r>
-        <w:rPr>
-          <w:rtl w:val="0"/>
-        </w:rPr>
-        <w:t xml:space="preserve">He picked up the burnt end of the branch and made a mark on the stone. Day 52 if the marks on the stone were accurate. He couldn't be sure. Day and nights had begun to blend together creating confusion, but he knew it was a long time. Much too long.</w:t>
-      </w:r>
-    </w:p>
-    <w:p>
-      <w:pPr>
-        <w:jc w:val="both"/>
-        <w:rPr/>
-      </w:pPr>
-      <w:r>
-        <w:rPr>
-          <w:rtl w:val="0"/>
-        </w:rPr>
-      </w:r>
-    </w:p>
-    <w:p>
-      <w:pPr>
-        <w:jc w:val="both"/>
-        <w:rPr/>
-      </w:pPr>
-      <w:r>
-        <w:rPr>
-          <w:rtl w:val="0"/>
-        </w:rPr>
-        <w:t xml:space="preserve">It was a weird concept. Why would I really need to generate a random paragraph? Could I actually learn something from doing so? All these questions were running through her head as she pressed the generate button. To her surprise, she found what she least expected to see.</w:t>
-      </w:r>
-    </w:p>
-    <w:p>
-      <w:pPr>
-        <w:jc w:val="both"/>
-        <w:rPr/>
-      </w:pPr>
-      <w:r>
-        <w:rPr>
-          <w:rtl w:val="0"/>
-        </w:rPr>
-      </w:r>
-    </w:p>
-    <w:p>
-      <w:pPr>
-        <w:jc w:val="both"/>
-        <w:rPr/>
-      </w:pPr>
-      <w:r>
-        <w:rPr>
-          <w:rtl w:val="0"/>
-        </w:rPr>
-        <w:t xml:space="preserve">It's not his fault. I know you're going to want to, but you can't blame him. He really has no idea how it happened. I kept trying to come up with excuses I could say to mom that would keep her calm when she found out what happened, but the more I tried, the more I could see none of them would work. He was going to get her wrath and there was nothing I could say to prevent it.</w:t>
-      </w:r>
-    </w:p>
-    <w:p>
-      <w:pPr>
-        <w:jc w:val="both"/>
-        <w:rPr/>
-      </w:pPr>
-      <w:r>
-        <w:rPr>
-          <w:rtl w:val="0"/>
-        </w:rPr>
-      </w:r>
-    </w:p>
-    <w:p>
-      <w:pPr>
-        <w:jc w:val="both"/>
-        <w:rPr/>
-      </w:pPr>
-      <w:r>
-        <w:rPr>
-          <w:rtl w:val="0"/>
-        </w:rPr>
-        <w:t xml:space="preserve">Where do they get a random paragraph?" he wondered as he clicked the generate button. Do they just write a random paragraph or do they get it somewhere? At that moment he read the random paragraph and realized it was about random paragraphs and his world would never be the same.</w:t>
-      </w:r>
-    </w:p>
-    <w:p>
-      <w:pPr>
-        <w:jc w:val="both"/>
-        <w:rPr/>
-      </w:pPr>
-      <w:r>
-        <w:rPr>
-          <w:rtl w:val="0"/>
-        </w:rPr>
-      </w:r>
-    </w:p>
-    <w:p>
-      <w:pPr>
-        <w:jc w:val="both"/>
-        <w:rPr/>
-      </w:pPr>
-      <w:r>
-        <w:rPr>
-          <w:rtl w:val="0"/>
-        </w:rPr>
-        <w:t xml:space="preserve">Sometimes there isn't a good answer. No matter how you try to rationalize the outcome, it doesn't make sense. And instead of an answer, you are simply left with a question. Why?</w:t>
+        <w:t xml:space="preserve">Space Exploration Technologies (NASDAQ: SPCX), better known as SpaceX, had a successful IPO launch. The stock popped 19% on its debut and has continued to trade even higher since. Even with SpaceX stock trading substantially above its IPO price as of this writing, many see potential catalysts for it to keep climbing over the long run. It claims to have the largest addressable market in history, thanks in large part to the growing demand for enterprise artificial intelligence (AI) infrastructure and its unique ability to serve that market. CEO Elon Musk even suggested SpaceX's revenue could hit $1 trillion by 2030 in a since-deleted post on X. So, should you buy the stock even after its strong debut? History provides a clear answer.</w:t>
+      </w:r>
+    </w:p>
+    <w:p>
+      <w:pPr>
+        <w:jc w:val="both"/>
+        <w:rPr/>
+      </w:pPr>
+      <w:r>
+        <w:rPr>
+          <w:rtl w:val="0"/>
+        </w:rPr>
+      </w:r>
+    </w:p>
+    <w:p>
+      <w:pPr>
+        <w:jc w:val="both"/>
+        <w:rPr/>
+      </w:pPr>
+      <w:r>
+        <w:rPr>
+          <w:rtl w:val="0"/>
+        </w:rPr>
+        <w:t xml:space="preserve">SpaceX is unlike any IPO in history. It garnered a massive valuation of $1.77 trillion at its IPO price and raised about $85.7 billion in its offering after underwriters exercised their option to buy more shares. Both are records. Still, it may be helpful to look at the track record of IPOs in general and of those more similar to SpaceX over the last 65 years.</w:t>
+      </w:r>
+    </w:p>
+    <w:p>
+      <w:pPr>
+        <w:jc w:val="both"/>
+        <w:rPr/>
+      </w:pPr>
+      <w:r>
+        <w:rPr>
+          <w:rtl w:val="0"/>
+        </w:rPr>
+      </w:r>
+    </w:p>
+    <w:p>
+      <w:pPr>
+        <w:jc w:val="both"/>
+        <w:rPr/>
+      </w:pPr>
+      <w:r>
+        <w:rPr>
+          <w:rtl w:val="0"/>
+        </w:rPr>
+        <w:t xml:space="preserve">Professor Jay Ritter has collected data on U.S. IPOs since 1960. The average first-day return is 17.7% through 2025. To that end, SpaceX's 19% first-day return is right in line with the average, although slightly below the average of IPOs since 2010 (22%). However, the average IPO doesn't fare so well in the long run after that first-day pop. Since 1980, the average one-year return for IPO stocks has been just 5.6%, well below the S&amp;P 500's (SNPINDEX: ^GSPC) average return.</w:t>
+      </w:r>
+    </w:p>
+    <w:p>
+      <w:pPr>
+        <w:jc w:val="both"/>
+        <w:rPr/>
+      </w:pPr>
+      <w:r>
+        <w:rPr>
+          <w:rtl w:val="0"/>
+        </w:rPr>
+      </w:r>
+    </w:p>
+    <w:p>
+      <w:pPr>
+        <w:jc w:val="both"/>
+        <w:rPr/>
+      </w:pPr>
+      <w:r>
+        <w:rPr>
+          <w:rtl w:val="0"/>
+        </w:rPr>
+        <w:t xml:space="preserve">That number has fallen into negative territory in recent years. The average one-year returns for IPOs in 2021 through 2024 ranged from -11.6% to -49.1%. The average since 2011 is -1.7%. While some volatility is expected in the first year of an IPO, they've still struggled to outperform the market on average within the first three years following their debut. Total returns for IPOs since 1980 over their first three years of trading trail the market by 20.5 percentage points.</w:t>
+      </w:r>
+    </w:p>
+    <w:p>
+      <w:pPr>
+        <w:jc w:val="both"/>
+        <w:rPr/>
+      </w:pPr>
+      <w:r>
+        <w:rPr>
+          <w:rtl w:val="0"/>
+        </w:rPr>
+      </w:r>
+    </w:p>
+    <w:p>
+      <w:pPr>
+        <w:jc w:val="both"/>
+        <w:rPr/>
+      </w:pPr>
+      <w:r>
+        <w:rPr>
+          <w:rtl w:val="0"/>
+        </w:rPr>
+        <w:t xml:space="preserve">Tech companies tend to fare better than non-tech companies, though. The average three-year buy-and-hold return from their first closing price for tech stocks since 1980 only trails the market by 12.7 percentage points. If you look at tech IPOs with more than $100 million in sales and exclude companies that went public at the height of the dot-com bubble, you finally get some good news. Those issues produced average three-year returns of 53.1% from their first close, beating the market average by 13.7%. For reference, though, SpaceX stock is already up nearly 30% from its first-day close as of this writing, so there's still not that much upside left based on historical averages.</w:t>
       </w:r>
     </w:p>
     <w:p>

</xml_diff>